<commit_message>
Add test 02 evidence for invalid inputs
</commit_message>
<xml_diff>
--- a/Screenshots/FoodStorageSystemOutputs.v1.1.docx
+++ b/Screenshots/FoodStorageSystemOutputs.v1.1.docx
@@ -185,6 +185,51 @@
           <w:rFonts w:hint="default"/>
         </w:rPr>
       </w:pPr>
+      <w:r>
+        <w:rPr>
+          <w:rFonts w:hint="default"/>
+          <w:lang w:val="en-IE"/>
+        </w:rPr>
+        <w:drawing>
+          <wp:inline distT="0" distB="0" distL="114300" distR="114300">
+            <wp:extent cx="4229100" cy="3589020"/>
+            <wp:effectExtent l="0" t="0" r="7620" b="7620"/>
+            <wp:docPr id="4" name="Picture 4" descr="{A41016D0-A8FB-45EF-96A5-394CECDBF1F7}"/>
+            <wp:cNvGraphicFramePr>
+              <a:graphicFrameLocks xmlns:a="http://schemas.openxmlformats.org/drawingml/2006/main" noChangeAspect="1"/>
+            </wp:cNvGraphicFramePr>
+            <a:graphic xmlns:a="http://schemas.openxmlformats.org/drawingml/2006/main">
+              <a:graphicData uri="http://schemas.openxmlformats.org/drawingml/2006/picture">
+                <pic:pic xmlns:pic="http://schemas.openxmlformats.org/drawingml/2006/picture">
+                  <pic:nvPicPr>
+                    <pic:cNvPr id="4" name="Picture 4" descr="{A41016D0-A8FB-45EF-96A5-394CECDBF1F7}"/>
+                    <pic:cNvPicPr>
+                      <a:picLocks noChangeAspect="1"/>
+                    </pic:cNvPicPr>
+                  </pic:nvPicPr>
+                  <pic:blipFill>
+                    <a:blip r:embed="rId5"/>
+                    <a:stretch>
+                      <a:fillRect/>
+                    </a:stretch>
+                  </pic:blipFill>
+                  <pic:spPr>
+                    <a:xfrm>
+                      <a:off x="0" y="0"/>
+                      <a:ext cx="4229100" cy="3589020"/>
+                    </a:xfrm>
+                    <a:prstGeom prst="rect">
+                      <a:avLst/>
+                    </a:prstGeom>
+                  </pic:spPr>
+                </pic:pic>
+              </a:graphicData>
+            </a:graphic>
+          </wp:inline>
+        </w:drawing>
+      </w:r>
+      <w:bookmarkStart w:id="0" w:name="_GoBack"/>
+      <w:bookmarkEnd w:id="0"/>
     </w:p>
     <w:p>
       <w:pPr>
@@ -448,8 +493,6 @@
         </w:rPr>
         <w:t>Evidence of: Handling empty data and preventing errors when no items are available.</w:t>
       </w:r>
-      <w:bookmarkStart w:id="0" w:name="_GoBack"/>
-      <w:bookmarkEnd w:id="0"/>
     </w:p>
     <w:sectPr>
       <w:pgSz w:w="11906" w:h="16838"/>

</xml_diff>